<commit_message>
Add bio and 3 problems for Day 1
</commit_message>
<xml_diff>
--- a/Homeschool_Business_Plan.docx
+++ b/Homeschool_Business_Plan.docx
@@ -6423,7 +6423,7 @@
     </w:p>
     <w:p>
       <w:r>
-        <w:t>(To be filled in)</w:t>
+        <w:t>Hi! I'm Sarah Hacker, and I've been a homeschooling mom for 13 years. I've homeschooled all 5 of my children through elementary and middle school, and along the way I've learned what works, what doesn't, and how to build a routine that fits a busy family. Now I'd love to share that experience and help other moms navigate their own homeschooling journey with more confidence and less stress.</w:t>
       </w:r>
     </w:p>
     <w:p/>
@@ -6437,17 +6437,22 @@
     </w:p>
     <w:p>
       <w:r>
-        <w:t>1. (To be filled in)</w:t>
-      </w:r>
-    </w:p>
-    <w:p>
-      <w:r>
-        <w:t>2. (To be filled in)</w:t>
-      </w:r>
-    </w:p>
-    <w:p>
-      <w:r>
-        <w:t>3. (To be filled in)</w:t>
+        <w:t>1. Picking the right curriculum for each child.</w:t>
+      </w:r>
+    </w:p>
+    <w:p>
+      <w:r>
+        <w:t>2. Creating daily schedules and balance for the whole family.</w:t>
+      </w:r>
+    </w:p>
+    <w:p>
+      <w:r>
+        <w:t>3. Homeschooling through learning challenges and attachment issues.</w:t>
+      </w:r>
+    </w:p>
+    <w:p>
+      <w:r>
+        <w:t>4. Picking the right co-op or tutorial program.</w:t>
       </w:r>
     </w:p>
     <w:sectPr>

</xml_diff>

<commit_message>
Add business name MyHomeschoolHelp
</commit_message>
<xml_diff>
--- a/Homeschool_Business_Plan.docx
+++ b/Homeschool_Business_Plan.docx
@@ -6453,6 +6453,14 @@
     <w:p>
       <w:r>
         <w:t>4. Picking the right co-op or tutorial program.</w:t>
+      </w:r>
+    </w:p>
+    <w:p>
+      <w:r>
+        <w:rPr>
+          <w:b/>
+        </w:rPr>
+        <w:t>Business Name: MyHomeschoolHelp</w:t>
       </w:r>
     </w:p>
     <w:sectPr>

</xml_diff>